<commit_message>
feat(Web/PR1): fix report format to match instructor template
</commit_message>
<xml_diff>
--- a/Year-2/Semester-2/Web/PR/PR1/Звіт_ПР1.docx
+++ b/Year-2/Semester-2/Web/PR/PR1/Звіт_ПР1.docx
@@ -41,7 +41,7 @@
           <w:sz w:val="24"/>
           <w:szCs w:val="24"/>
         </w:rPr>
-        <w:t xml:space="preserve">«Київський політехнічний інститут ім. І. Сікорського»</w:t>
+        <w:t xml:space="preserve">«Київський політехнічний інститут  ім. І. Сікорського»</w:t>
       </w:r>
     </w:p>
     <w:p>
@@ -436,19 +436,15 @@
     </w:p>
     <w:p>
       <w:pPr>
-        <w:spacing w:after="0" w:line="360"/>
-        <w:jc w:val="both"/>
-      </w:pPr>
-      <w:r>
-        <w:rPr>
-          <w:rFonts w:ascii="Times New Roman" w:cs="Times New Roman" w:eastAsia="Times New Roman" w:hAnsi="Times New Roman"/>
-          <w:sz w:val="28"/>
-          <w:szCs w:val="28"/>
-        </w:rPr>
-        <w:t xml:space="preserve"/>
-      </w:r>
-    </w:p>
-    <w:p>
+        <w:spacing w:after="0"/>
+      </w:pPr>
+      <w:r>
+        <w:rPr>
+          <w:rFonts w:ascii="Times New Roman" w:cs="Times New Roman" w:eastAsia="Times New Roman" w:hAnsi="Times New Roman"/>
+          <w:sz w:val="28"/>
+          <w:szCs w:val="28"/>
+        </w:rPr>
+      </w:r>
       <w:r>
         <w:rPr>
           <w:rFonts w:ascii="Times New Roman" w:cs="Times New Roman" w:eastAsia="Times New Roman" w:hAnsi="Times New Roman"/>
@@ -460,8 +456,8 @@
     </w:p>
     <w:p>
       <w:pPr>
-        <w:pStyle w:val="Heading1"/>
-        <w:spacing w:after="200" w:before="300"/>
+        <w:spacing w:after="200" w:line="360"/>
+        <w:jc w:val="center"/>
       </w:pPr>
       <w:r>
         <w:rPr>
@@ -471,233 +467,13 @@
           <w:sz w:val="36"/>
           <w:szCs w:val="36"/>
         </w:rPr>
-        <w:t xml:space="preserve">Завдання</w:t>
-      </w:r>
-    </w:p>
-    <w:p>
-      <w:pPr>
-        <w:spacing w:after="80" w:line="360"/>
-        <w:jc w:val="both"/>
-      </w:pPr>
-      <w:r>
-        <w:rPr>
-          <w:rFonts w:ascii="Times New Roman" w:cs="Times New Roman" w:eastAsia="Times New Roman" w:hAnsi="Times New Roman"/>
-          <w:b/>
-          <w:bCs/>
-          <w:sz w:val="28"/>
-          <w:szCs w:val="28"/>
-        </w:rPr>
-        <w:t xml:space="preserve">Варіант 15: </w:t>
-      </w:r>
-      <w:r>
-        <w:rPr>
-          <w:rFonts w:ascii="Times New Roman" w:cs="Times New Roman" w:eastAsia="Times New Roman" w:hAnsi="Times New Roman"/>
-          <w:sz w:val="28"/>
-          <w:szCs w:val="28"/>
-        </w:rPr>
-        <w:t xml:space="preserve">Вітрова станція «Приазовська», 150 МВт</w:t>
-      </w:r>
-    </w:p>
-    <w:p>
-      <w:pPr>
-        <w:spacing w:after="40" w:line="360"/>
-        <w:jc w:val="both"/>
-      </w:pPr>
-      <w:r>
-        <w:rPr>
-          <w:rFonts w:ascii="Times New Roman" w:cs="Times New Roman" w:eastAsia="Times New Roman" w:hAnsi="Times New Roman"/>
-          <w:b/>
-          <w:bCs/>
-          <w:sz w:val="28"/>
-          <w:szCs w:val="28"/>
-        </w:rPr>
-        <w:t xml:space="preserve">Спільне завдання:</w:t>
-      </w:r>
-    </w:p>
-    <w:p>
-      <w:pPr>
-        <w:spacing w:after="40" w:line="360"/>
-        <w:jc w:val="both"/>
-      </w:pPr>
-      <w:r>
-        <w:rPr>
-          <w:rFonts w:ascii="Times New Roman" w:cs="Times New Roman" w:eastAsia="Times New Roman" w:hAnsi="Times New Roman"/>
-          <w:sz w:val="28"/>
-          <w:szCs w:val="28"/>
-        </w:rPr>
-        <w:t xml:space="preserve">1. Створити HTML-структуру з відповідними семантичними тегами</w:t>
-      </w:r>
-    </w:p>
-    <w:p>
-      <w:pPr>
-        <w:spacing w:after="40" w:line="360"/>
-        <w:jc w:val="both"/>
-      </w:pPr>
-      <w:r>
-        <w:rPr>
-          <w:rFonts w:ascii="Times New Roman" w:cs="Times New Roman" w:eastAsia="Times New Roman" w:hAnsi="Times New Roman"/>
-          <w:sz w:val="28"/>
-          <w:szCs w:val="28"/>
-        </w:rPr>
-        <w:t xml:space="preserve">2. Додати навігаційне меню з посиланнями на розділи: Про об'єкт, Параметри, Схема, Контакти</w:t>
-      </w:r>
-    </w:p>
-    <w:p>
-      <w:pPr>
-        <w:spacing w:after="40" w:line="360"/>
-        <w:jc w:val="both"/>
-      </w:pPr>
-      <w:r>
-        <w:rPr>
-          <w:rFonts w:ascii="Times New Roman" w:cs="Times New Roman" w:eastAsia="Times New Roman" w:hAnsi="Times New Roman"/>
-          <w:sz w:val="28"/>
-          <w:szCs w:val="28"/>
-        </w:rPr>
-        <w:t xml:space="preserve">3. Оформити заголовок з назвою об'єкта</w:t>
-      </w:r>
-    </w:p>
-    <w:p>
-      <w:pPr>
-        <w:spacing w:after="40" w:line="360"/>
-        <w:jc w:val="both"/>
-      </w:pPr>
-      <w:r>
-        <w:rPr>
-          <w:rFonts w:ascii="Times New Roman" w:cs="Times New Roman" w:eastAsia="Times New Roman" w:hAnsi="Times New Roman"/>
-          <w:sz w:val="28"/>
-          <w:szCs w:val="28"/>
-        </w:rPr>
-        <w:t xml:space="preserve">4. Написати детальний опис об'єкта (історія, призначення, особливості) — мінімум 2 абзаци</w:t>
-      </w:r>
-    </w:p>
-    <w:p>
-      <w:pPr>
-        <w:spacing w:after="40" w:line="360"/>
-        <w:jc w:val="both"/>
-      </w:pPr>
-      <w:r>
-        <w:rPr>
-          <w:rFonts w:ascii="Times New Roman" w:cs="Times New Roman" w:eastAsia="Times New Roman" w:hAnsi="Times New Roman"/>
-          <w:sz w:val="28"/>
-          <w:szCs w:val="28"/>
-        </w:rPr>
-        <w:t xml:space="preserve">5. Створити таблицю технічних параметрів з 7–10 рядками (потужність, напруга, рік введення, обладнання тощо)</w:t>
-      </w:r>
-    </w:p>
-    <w:p>
-      <w:pPr>
-        <w:spacing w:after="40" w:line="360"/>
-        <w:jc w:val="both"/>
-      </w:pPr>
-      <w:r>
-        <w:rPr>
-          <w:rFonts w:ascii="Times New Roman" w:cs="Times New Roman" w:eastAsia="Times New Roman" w:hAnsi="Times New Roman"/>
-          <w:sz w:val="28"/>
-          <w:szCs w:val="28"/>
-        </w:rPr>
-        <w:t xml:space="preserve">6. Додати 2–3 зображення (використати реальні фото або placeholder)</w:t>
-      </w:r>
-    </w:p>
-    <w:p>
-      <w:pPr>
-        <w:spacing w:after="40" w:line="360"/>
-        <w:jc w:val="both"/>
-      </w:pPr>
-      <w:r>
-        <w:rPr>
-          <w:rFonts w:ascii="Times New Roman" w:cs="Times New Roman" w:eastAsia="Times New Roman" w:hAnsi="Times New Roman"/>
-          <w:sz w:val="28"/>
-          <w:szCs w:val="28"/>
-        </w:rPr>
-        <w:t xml:space="preserve">7. Використати Bootstrap для адаптивної сітки та компонентів (navbar, cards, table)</w:t>
-      </w:r>
-    </w:p>
-    <w:p>
-      <w:pPr>
-        <w:spacing w:after="40" w:line="360"/>
-        <w:jc w:val="both"/>
-      </w:pPr>
-      <w:r>
-        <w:rPr>
-          <w:rFonts w:ascii="Times New Roman" w:cs="Times New Roman" w:eastAsia="Times New Roman" w:hAnsi="Times New Roman"/>
-          <w:sz w:val="28"/>
-          <w:szCs w:val="28"/>
-        </w:rPr>
-        <w:t xml:space="preserve">8. Створити власний CSS файл з унікальними стилями та анімаціями</w:t>
-      </w:r>
-    </w:p>
-    <w:p>
-      <w:pPr>
-        <w:spacing w:after="40" w:line="360"/>
-        <w:jc w:val="both"/>
-      </w:pPr>
-      <w:r>
-        <w:rPr>
-          <w:rFonts w:ascii="Times New Roman" w:cs="Times New Roman" w:eastAsia="Times New Roman" w:hAnsi="Times New Roman"/>
-          <w:sz w:val="28"/>
-          <w:szCs w:val="28"/>
-        </w:rPr>
-        <w:t xml:space="preserve">9. Додати контактну інформацію у нижньому колонтитулі</w:t>
-      </w:r>
-    </w:p>
-    <w:p>
-      <w:pPr>
-        <w:spacing w:after="40" w:line="360"/>
-        <w:jc w:val="both"/>
-      </w:pPr>
-      <w:r>
-        <w:rPr>
-          <w:rFonts w:ascii="Times New Roman" w:cs="Times New Roman" w:eastAsia="Times New Roman" w:hAnsi="Times New Roman"/>
-          <w:sz w:val="28"/>
-          <w:szCs w:val="28"/>
-        </w:rPr>
-        <w:t xml:space="preserve">10. Перевірити адаптивність на різних розмірах екранів</w:t>
-      </w:r>
-    </w:p>
-    <w:p>
-      <w:pPr>
-        <w:spacing w:after="120" w:line="360"/>
-        <w:jc w:val="both"/>
-      </w:pPr>
-      <w:r>
-        <w:rPr>
-          <w:rFonts w:ascii="Times New Roman" w:cs="Times New Roman" w:eastAsia="Times New Roman" w:hAnsi="Times New Roman"/>
-          <w:b/>
-          <w:bCs/>
-          <w:sz w:val="28"/>
-          <w:szCs w:val="28"/>
-        </w:rPr>
-        <w:t xml:space="preserve">Параметри об'єкта: </w:t>
-      </w:r>
-      <w:r>
-        <w:rPr>
-          <w:rFonts w:ascii="Times New Roman" w:cs="Times New Roman" w:eastAsia="Times New Roman" w:hAnsi="Times New Roman"/>
-          <w:sz w:val="28"/>
-          <w:szCs w:val="28"/>
-        </w:rPr>
-        <w:t xml:space="preserve">тип — вітрова електростанція, потужність — 150 МВт, напруга — 0,69/35 кВ, місцезнаходження — Запорізька обл.</w:t>
-      </w:r>
-    </w:p>
-    <w:p>
-      <w:pPr>
-        <w:pStyle w:val="Heading1"/>
-        <w:spacing w:after="200" w:before="300"/>
-      </w:pPr>
-      <w:r>
-        <w:rPr>
-          <w:rFonts w:ascii="Times New Roman" w:cs="Times New Roman" w:eastAsia="Times New Roman" w:hAnsi="Times New Roman"/>
-          <w:b/>
-          <w:bCs/>
-          <w:sz w:val="36"/>
-          <w:szCs w:val="36"/>
-        </w:rPr>
-        <w:t xml:space="preserve">Хід виконання</w:t>
-      </w:r>
-    </w:p>
-    <w:p>
-      <w:pPr>
-        <w:pStyle w:val="Heading2"/>
-        <w:spacing w:after="160" w:before="240"/>
+        <w:t xml:space="preserve">Практична робота № 1</w:t>
+      </w:r>
+    </w:p>
+    <w:p>
+      <w:pPr>
+        <w:spacing w:after="120" w:line="360"/>
+        <w:jc w:val="both"/>
       </w:pPr>
       <w:r>
         <w:rPr>
@@ -707,58 +483,231 @@
           <w:sz w:val="32"/>
           <w:szCs w:val="32"/>
         </w:rPr>
-        <w:t xml:space="preserve">1. Проєктування</w:t>
-      </w:r>
-    </w:p>
-    <w:p>
-      <w:pPr>
-        <w:spacing w:after="120" w:line="360"/>
-        <w:ind w:firstLine="720"/>
-        <w:jc w:val="both"/>
-      </w:pPr>
-      <w:r>
-        <w:rPr>
-          <w:rFonts w:ascii="Times New Roman" w:cs="Times New Roman" w:eastAsia="Times New Roman" w:hAnsi="Times New Roman"/>
-          <w:sz w:val="28"/>
-          <w:szCs w:val="28"/>
-        </w:rPr>
-        <w:t xml:space="preserve">Обрано варіант 15 — Вітрова станція «Приазовська». Проведено аналіз типової структури ВЕС: принцип роботи, основне обладнання (50 турбін Vestas V117-3.45 MW, трансформатори 0,69/35 кВ, кабельна мережа, підстанція 35/110 кВ), режим експлуатації.</w:t>
-      </w:r>
-    </w:p>
-    <w:p>
-      <w:pPr>
-        <w:spacing w:after="120" w:line="360"/>
-        <w:ind w:firstLine="720"/>
-        <w:jc w:val="both"/>
-      </w:pPr>
-      <w:r>
-        <w:rPr>
-          <w:rFonts w:ascii="Times New Roman" w:cs="Times New Roman" w:eastAsia="Times New Roman" w:hAnsi="Times New Roman"/>
-          <w:sz w:val="28"/>
-          <w:szCs w:val="28"/>
-        </w:rPr>
-        <w:t xml:space="preserve">Спроєктовано структуру сторінки з розділами: навігація, hero-секція, статистика, «Про об'єкт», «Особливості», «Технічні параметри», «Схема», «Контакти», футер. Обрано адаптивний макет на основі Bootstrap Grid (col-lg-7 + col-lg-5).</w:t>
-      </w:r>
-    </w:p>
-    <w:p>
-      <w:pPr>
-        <w:spacing w:after="120" w:line="360"/>
-        <w:ind w:firstLine="720"/>
-        <w:jc w:val="both"/>
-      </w:pPr>
-      <w:r>
-        <w:rPr>
-          <w:rFonts w:ascii="Times New Roman" w:cs="Times New Roman" w:eastAsia="Times New Roman" w:hAnsi="Times New Roman"/>
-          <w:sz w:val="28"/>
-          <w:szCs w:val="28"/>
-        </w:rPr>
-        <w:t xml:space="preserve">Колірна схема обрана тематично: блакитний (#0d6efd) — небо, темно-зелений (#1a6b5a) — природа, аква (#29d9c2) — чиста енергія.</w:t>
-      </w:r>
-    </w:p>
-    <w:p>
-      <w:pPr>
-        <w:pStyle w:val="Heading2"/>
-        <w:spacing w:after="160" w:before="240"/>
+        <w:t xml:space="preserve">Завдання:</w:t>
+      </w:r>
+    </w:p>
+    <w:p>
+      <w:pPr>
+        <w:spacing w:after="80" w:line="360"/>
+        <w:jc w:val="both"/>
+      </w:pPr>
+      <w:r>
+        <w:rPr>
+          <w:rFonts w:ascii="Times New Roman" w:cs="Times New Roman" w:eastAsia="Times New Roman" w:hAnsi="Times New Roman"/>
+          <w:b/>
+          <w:bCs/>
+          <w:sz w:val="28"/>
+          <w:szCs w:val="28"/>
+        </w:rPr>
+        <w:t xml:space="preserve">Варіант 15: </w:t>
+      </w:r>
+      <w:r>
+        <w:rPr>
+          <w:rFonts w:ascii="Times New Roman" w:cs="Times New Roman" w:eastAsia="Times New Roman" w:hAnsi="Times New Roman"/>
+          <w:sz w:val="28"/>
+          <w:szCs w:val="28"/>
+        </w:rPr>
+        <w:t xml:space="preserve">Вітрова станція «Приазовська», 150 МВт</w:t>
+      </w:r>
+    </w:p>
+    <w:p>
+      <w:pPr>
+        <w:spacing w:after="40" w:line="360"/>
+        <w:jc w:val="both"/>
+      </w:pPr>
+      <w:r>
+        <w:rPr>
+          <w:rFonts w:ascii="Times New Roman" w:cs="Times New Roman" w:eastAsia="Times New Roman" w:hAnsi="Times New Roman"/>
+          <w:b/>
+          <w:bCs/>
+          <w:sz w:val="28"/>
+          <w:szCs w:val="28"/>
+        </w:rPr>
+        <w:t xml:space="preserve">Спільне завдання:</w:t>
+      </w:r>
+    </w:p>
+    <w:p>
+      <w:pPr>
+        <w:spacing w:after="40" w:line="360"/>
+        <w:jc w:val="both"/>
+      </w:pPr>
+      <w:r>
+        <w:rPr>
+          <w:rFonts w:ascii="Times New Roman" w:cs="Times New Roman" w:eastAsia="Times New Roman" w:hAnsi="Times New Roman"/>
+          <w:sz w:val="28"/>
+          <w:szCs w:val="28"/>
+        </w:rPr>
+        <w:t xml:space="preserve">1. Створити HTML-структуру з відповідними семантичними тегами</w:t>
+      </w:r>
+    </w:p>
+    <w:p>
+      <w:pPr>
+        <w:spacing w:after="40" w:line="360"/>
+        <w:jc w:val="both"/>
+      </w:pPr>
+      <w:r>
+        <w:rPr>
+          <w:rFonts w:ascii="Times New Roman" w:cs="Times New Roman" w:eastAsia="Times New Roman" w:hAnsi="Times New Roman"/>
+          <w:sz w:val="28"/>
+          <w:szCs w:val="28"/>
+        </w:rPr>
+        <w:t xml:space="preserve">2. Додати навігаційне меню з посиланнями на розділи: Про об'єкт, Параметри, Схема, Контакти</w:t>
+      </w:r>
+    </w:p>
+    <w:p>
+      <w:pPr>
+        <w:spacing w:after="40" w:line="360"/>
+        <w:jc w:val="both"/>
+      </w:pPr>
+      <w:r>
+        <w:rPr>
+          <w:rFonts w:ascii="Times New Roman" w:cs="Times New Roman" w:eastAsia="Times New Roman" w:hAnsi="Times New Roman"/>
+          <w:sz w:val="28"/>
+          <w:szCs w:val="28"/>
+        </w:rPr>
+        <w:t xml:space="preserve">3. Оформити заголовок з назвою об'єкта</w:t>
+      </w:r>
+    </w:p>
+    <w:p>
+      <w:pPr>
+        <w:spacing w:after="40" w:line="360"/>
+        <w:jc w:val="both"/>
+      </w:pPr>
+      <w:r>
+        <w:rPr>
+          <w:rFonts w:ascii="Times New Roman" w:cs="Times New Roman" w:eastAsia="Times New Roman" w:hAnsi="Times New Roman"/>
+          <w:sz w:val="28"/>
+          <w:szCs w:val="28"/>
+        </w:rPr>
+        <w:t xml:space="preserve">4. Написати детальний опис об'єкта (історія, призначення, особливості) — мінімум 2 абзаци</w:t>
+      </w:r>
+    </w:p>
+    <w:p>
+      <w:pPr>
+        <w:spacing w:after="40" w:line="360"/>
+        <w:jc w:val="both"/>
+      </w:pPr>
+      <w:r>
+        <w:rPr>
+          <w:rFonts w:ascii="Times New Roman" w:cs="Times New Roman" w:eastAsia="Times New Roman" w:hAnsi="Times New Roman"/>
+          <w:sz w:val="28"/>
+          <w:szCs w:val="28"/>
+        </w:rPr>
+        <w:t xml:space="preserve">5. Створити таблицю технічних параметрів з 7–10 рядками (потужність, напруга, рік введення, обладнання тощо)</w:t>
+      </w:r>
+    </w:p>
+    <w:p>
+      <w:pPr>
+        <w:spacing w:after="40" w:line="360"/>
+        <w:jc w:val="both"/>
+      </w:pPr>
+      <w:r>
+        <w:rPr>
+          <w:rFonts w:ascii="Times New Roman" w:cs="Times New Roman" w:eastAsia="Times New Roman" w:hAnsi="Times New Roman"/>
+          <w:sz w:val="28"/>
+          <w:szCs w:val="28"/>
+        </w:rPr>
+        <w:t xml:space="preserve">6. Додати 2–3 зображення (використати реальні фото або placeholder)</w:t>
+      </w:r>
+    </w:p>
+    <w:p>
+      <w:pPr>
+        <w:spacing w:after="40" w:line="360"/>
+        <w:jc w:val="both"/>
+      </w:pPr>
+      <w:r>
+        <w:rPr>
+          <w:rFonts w:ascii="Times New Roman" w:cs="Times New Roman" w:eastAsia="Times New Roman" w:hAnsi="Times New Roman"/>
+          <w:sz w:val="28"/>
+          <w:szCs w:val="28"/>
+        </w:rPr>
+        <w:t xml:space="preserve">7. Використати Bootstrap для адаптивної сітки та компонентів (navbar, cards, table)</w:t>
+      </w:r>
+    </w:p>
+    <w:p>
+      <w:pPr>
+        <w:spacing w:after="40" w:line="360"/>
+        <w:jc w:val="both"/>
+      </w:pPr>
+      <w:r>
+        <w:rPr>
+          <w:rFonts w:ascii="Times New Roman" w:cs="Times New Roman" w:eastAsia="Times New Roman" w:hAnsi="Times New Roman"/>
+          <w:sz w:val="28"/>
+          <w:szCs w:val="28"/>
+        </w:rPr>
+        <w:t xml:space="preserve">8. Створити власний CSS файл з унікальними стилями та анімаціями</w:t>
+      </w:r>
+    </w:p>
+    <w:p>
+      <w:pPr>
+        <w:spacing w:after="40" w:line="360"/>
+        <w:jc w:val="both"/>
+      </w:pPr>
+      <w:r>
+        <w:rPr>
+          <w:rFonts w:ascii="Times New Roman" w:cs="Times New Roman" w:eastAsia="Times New Roman" w:hAnsi="Times New Roman"/>
+          <w:sz w:val="28"/>
+          <w:szCs w:val="28"/>
+        </w:rPr>
+        <w:t xml:space="preserve">9. Додати контактну інформацію у нижньому колонтитулі</w:t>
+      </w:r>
+    </w:p>
+    <w:p>
+      <w:pPr>
+        <w:spacing w:after="40" w:line="360"/>
+        <w:jc w:val="both"/>
+      </w:pPr>
+      <w:r>
+        <w:rPr>
+          <w:rFonts w:ascii="Times New Roman" w:cs="Times New Roman" w:eastAsia="Times New Roman" w:hAnsi="Times New Roman"/>
+          <w:sz w:val="28"/>
+          <w:szCs w:val="28"/>
+        </w:rPr>
+        <w:t xml:space="preserve">10. Перевірити адаптивність на різних розмірах екранів</w:t>
+      </w:r>
+    </w:p>
+    <w:p>
+      <w:pPr>
+        <w:spacing w:after="120" w:line="360"/>
+        <w:jc w:val="both"/>
+      </w:pPr>
+      <w:r>
+        <w:rPr>
+          <w:rFonts w:ascii="Times New Roman" w:cs="Times New Roman" w:eastAsia="Times New Roman" w:hAnsi="Times New Roman"/>
+          <w:b/>
+          <w:bCs/>
+          <w:sz w:val="28"/>
+          <w:szCs w:val="28"/>
+        </w:rPr>
+        <w:t xml:space="preserve">Параметри об'єкта: </w:t>
+      </w:r>
+      <w:r>
+        <w:rPr>
+          <w:rFonts w:ascii="Times New Roman" w:cs="Times New Roman" w:eastAsia="Times New Roman" w:hAnsi="Times New Roman"/>
+          <w:sz w:val="28"/>
+          <w:szCs w:val="28"/>
+        </w:rPr>
+        <w:t xml:space="preserve">тип — вітрова електростанція, потужність — 150 МВт, напруга — 0,69/35 кВ, місцезнаходження — Запорізька обл.</w:t>
+      </w:r>
+    </w:p>
+    <w:p>
+      <w:pPr>
+        <w:spacing w:after="120" w:line="360"/>
+        <w:jc w:val="both"/>
+      </w:pPr>
+      <w:r>
+        <w:rPr>
+          <w:rFonts w:ascii="Times New Roman" w:cs="Times New Roman" w:eastAsia="Times New Roman" w:hAnsi="Times New Roman"/>
+          <w:sz w:val="28"/>
+          <w:szCs w:val="28"/>
+        </w:rPr>
+        <w:t xml:space="preserve"/>
+      </w:r>
+    </w:p>
+    <w:p>
+      <w:pPr>
+        <w:spacing w:after="160" w:line="360"/>
+        <w:jc w:val="both"/>
       </w:pPr>
       <w:r>
         <w:rPr>
@@ -768,6 +717,83 @@
           <w:sz w:val="32"/>
           <w:szCs w:val="32"/>
         </w:rPr>
+        <w:t xml:space="preserve">Хід виконання:</w:t>
+      </w:r>
+    </w:p>
+    <w:p>
+      <w:pPr>
+        <w:spacing w:after="80" w:line="360"/>
+        <w:jc w:val="both"/>
+      </w:pPr>
+      <w:r>
+        <w:rPr>
+          <w:rFonts w:ascii="Times New Roman" w:cs="Times New Roman" w:eastAsia="Times New Roman" w:hAnsi="Times New Roman"/>
+          <w:b/>
+          <w:bCs/>
+          <w:sz w:val="28"/>
+          <w:szCs w:val="28"/>
+        </w:rPr>
+        <w:t xml:space="preserve">1. Проєктування</w:t>
+      </w:r>
+    </w:p>
+    <w:p>
+      <w:pPr>
+        <w:spacing w:after="120" w:line="360"/>
+        <w:ind w:firstLine="720"/>
+        <w:jc w:val="both"/>
+      </w:pPr>
+      <w:r>
+        <w:rPr>
+          <w:rFonts w:ascii="Times New Roman" w:cs="Times New Roman" w:eastAsia="Times New Roman" w:hAnsi="Times New Roman"/>
+          <w:sz w:val="28"/>
+          <w:szCs w:val="28"/>
+        </w:rPr>
+        <w:t xml:space="preserve">Обрано варіант 15 — Вітрова станція «Приазовська». Проведено аналіз типової структури ВЕС: принцип роботи, основне обладнання (50 турбін Vestas V117-3.45 MW, трансформатори 0,69/35 кВ, кабельна мережа, підстанція 35/110 кВ), режим експлуатації.</w:t>
+      </w:r>
+    </w:p>
+    <w:p>
+      <w:pPr>
+        <w:spacing w:after="120" w:line="360"/>
+        <w:ind w:firstLine="720"/>
+        <w:jc w:val="both"/>
+      </w:pPr>
+      <w:r>
+        <w:rPr>
+          <w:rFonts w:ascii="Times New Roman" w:cs="Times New Roman" w:eastAsia="Times New Roman" w:hAnsi="Times New Roman"/>
+          <w:sz w:val="28"/>
+          <w:szCs w:val="28"/>
+        </w:rPr>
+        <w:t xml:space="preserve">Спроєктовано структуру сторінки з розділами: навігація, hero-секція, статистика, «Про об'єкт», «Особливості», «Технічні параметри», «Схема», «Контакти», футер. Обрано адаптивний макет на основі Bootstrap Grid (col-lg-7 + col-lg-5).</w:t>
+      </w:r>
+    </w:p>
+    <w:p>
+      <w:pPr>
+        <w:spacing w:after="120" w:line="360"/>
+        <w:ind w:firstLine="720"/>
+        <w:jc w:val="both"/>
+      </w:pPr>
+      <w:r>
+        <w:rPr>
+          <w:rFonts w:ascii="Times New Roman" w:cs="Times New Roman" w:eastAsia="Times New Roman" w:hAnsi="Times New Roman"/>
+          <w:sz w:val="28"/>
+          <w:szCs w:val="28"/>
+        </w:rPr>
+        <w:t xml:space="preserve">Колірна схема обрана тематично: блакитний (#0d6efd) — небо, темно-зелений (#1a6b5a) — природа, аква (#29d9c2) — чиста енергія.</w:t>
+      </w:r>
+    </w:p>
+    <w:p>
+      <w:pPr>
+        <w:spacing w:after="80" w:line="360"/>
+        <w:jc w:val="both"/>
+      </w:pPr>
+      <w:r>
+        <w:rPr>
+          <w:rFonts w:ascii="Times New Roman" w:cs="Times New Roman" w:eastAsia="Times New Roman" w:hAnsi="Times New Roman"/>
+          <w:b/>
+          <w:bCs/>
+          <w:sz w:val="28"/>
+          <w:szCs w:val="28"/>
+        </w:rPr>
         <w:t xml:space="preserve">2. Файлова структура проєкту</w:t>
       </w:r>
     </w:p>
@@ -782,7 +808,7 @@
           <w:sz w:val="28"/>
           <w:szCs w:val="28"/>
         </w:rPr>
-        <w:t xml:space="preserve">PR1/index.html — головна сторінка (355 рядків)</w:t>
+        <w:t xml:space="preserve">PR1/index.html — головна сторінка</w:t>
       </w:r>
     </w:p>
     <w:p>
@@ -796,7 +822,7 @@
           <w:sz w:val="28"/>
           <w:szCs w:val="28"/>
         </w:rPr>
-        <w:t xml:space="preserve">PR1/styles.css — власні CSS-стилі (372 рядки)</w:t>
+        <w:t xml:space="preserve">PR1/styles.css — власні CSS-стилі</w:t>
       </w:r>
     </w:p>
     <w:p>
@@ -857,16 +883,16 @@
     </w:p>
     <w:p>
       <w:pPr>
-        <w:pStyle w:val="Heading2"/>
-        <w:spacing w:after="160" w:before="240"/>
-      </w:pPr>
-      <w:r>
-        <w:rPr>
-          <w:rFonts w:ascii="Times New Roman" w:cs="Times New Roman" w:eastAsia="Times New Roman" w:hAnsi="Times New Roman"/>
-          <w:b/>
-          <w:bCs/>
-          <w:sz w:val="32"/>
-          <w:szCs w:val="32"/>
+        <w:spacing w:after="80" w:line="360"/>
+        <w:jc w:val="both"/>
+      </w:pPr>
+      <w:r>
+        <w:rPr>
+          <w:rFonts w:ascii="Times New Roman" w:cs="Times New Roman" w:eastAsia="Times New Roman" w:hAnsi="Times New Roman"/>
+          <w:b/>
+          <w:bCs/>
+          <w:sz w:val="28"/>
+          <w:szCs w:val="28"/>
         </w:rPr>
         <w:t xml:space="preserve">3. Реалізація HTML-структури</w:t>
       </w:r>
@@ -1058,16 +1084,16 @@
     </w:p>
     <w:p>
       <w:pPr>
-        <w:pStyle w:val="Heading2"/>
-        <w:spacing w:after="160" w:before="240"/>
-      </w:pPr>
-      <w:r>
-        <w:rPr>
-          <w:rFonts w:ascii="Times New Roman" w:cs="Times New Roman" w:eastAsia="Times New Roman" w:hAnsi="Times New Roman"/>
-          <w:b/>
-          <w:bCs/>
-          <w:sz w:val="32"/>
-          <w:szCs w:val="32"/>
+        <w:spacing w:after="80" w:line="360"/>
+        <w:jc w:val="both"/>
+      </w:pPr>
+      <w:r>
+        <w:rPr>
+          <w:rFonts w:ascii="Times New Roman" w:cs="Times New Roman" w:eastAsia="Times New Roman" w:hAnsi="Times New Roman"/>
+          <w:b/>
+          <w:bCs/>
+          <w:sz w:val="28"/>
+          <w:szCs w:val="28"/>
         </w:rPr>
         <w:t xml:space="preserve">4. Реалізація CSS-стилів</w:t>
       </w:r>
@@ -1084,7 +1110,7 @@
           <w:sz w:val="28"/>
           <w:szCs w:val="28"/>
         </w:rPr>
-        <w:t xml:space="preserve">Файл styles.css (372 рядки) містить власні стилі поверх Bootstrap:</w:t>
+        <w:t xml:space="preserve">Файл styles.css містить власні стилі поверх Bootstrap:</w:t>
       </w:r>
     </w:p>
     <w:p>
@@ -1281,16 +1307,16 @@
     </w:p>
     <w:p>
       <w:pPr>
-        <w:pStyle w:val="Heading2"/>
-        <w:spacing w:after="160" w:before="240"/>
-      </w:pPr>
-      <w:r>
-        <w:rPr>
-          <w:rFonts w:ascii="Times New Roman" w:cs="Times New Roman" w:eastAsia="Times New Roman" w:hAnsi="Times New Roman"/>
-          <w:b/>
-          <w:bCs/>
-          <w:sz w:val="32"/>
-          <w:szCs w:val="32"/>
+        <w:spacing w:after="80" w:line="360"/>
+        <w:jc w:val="both"/>
+      </w:pPr>
+      <w:r>
+        <w:rPr>
+          <w:rFonts w:ascii="Times New Roman" w:cs="Times New Roman" w:eastAsia="Times New Roman" w:hAnsi="Times New Roman"/>
+          <w:b/>
+          <w:bCs/>
+          <w:sz w:val="28"/>
+          <w:szCs w:val="28"/>
         </w:rPr>
         <w:t xml:space="preserve">5. Зображення та контент</w:t>
       </w:r>
@@ -1316,7 +1342,7 @@
           <w:sz w:val="28"/>
           <w:szCs w:val="28"/>
         </w:rPr>
-        <w:t xml:space="preserve">(53 КБ) — фото вітрових турбін біля Азовського узбережжя на заході сонця. Використано у секції «Про об'єкт» як загальний вигляд. Alt: «Вітрова станція Приазовська — загальний вигляд».</w:t>
+        <w:t xml:space="preserve">— фото вітрових турбін біля Азовського узбережжя на заході сонця. Використано у секції «Про об'єкт» як загальний вигляд.</w:t>
       </w:r>
     </w:p>
     <w:p>
@@ -1340,7 +1366,7 @@
           <w:sz w:val="28"/>
           <w:szCs w:val="28"/>
         </w:rPr>
-        <w:t xml:space="preserve">(18 КБ) — фото турбін у степовому полі. Використано у секції «Схема» для відображення розташування. Alt: «Розташування вітрових турбін ВЕС Приазовська».</w:t>
+        <w:t xml:space="preserve">— фото турбін у степовому полі. Використано у секції «Схема» для відображення розташування.</w:t>
       </w:r>
     </w:p>
     <w:p>
@@ -1399,16 +1425,16 @@
     </w:p>
     <w:p>
       <w:pPr>
-        <w:pStyle w:val="Heading2"/>
-        <w:spacing w:after="160" w:before="240"/>
-      </w:pPr>
-      <w:r>
-        <w:rPr>
-          <w:rFonts w:ascii="Times New Roman" w:cs="Times New Roman" w:eastAsia="Times New Roman" w:hAnsi="Times New Roman"/>
-          <w:b/>
-          <w:bCs/>
-          <w:sz w:val="32"/>
-          <w:szCs w:val="32"/>
+        <w:spacing w:after="80" w:line="360"/>
+        <w:jc w:val="both"/>
+      </w:pPr>
+      <w:r>
+        <w:rPr>
+          <w:rFonts w:ascii="Times New Roman" w:cs="Times New Roman" w:eastAsia="Times New Roman" w:hAnsi="Times New Roman"/>
+          <w:b/>
+          <w:bCs/>
+          <w:sz w:val="28"/>
+          <w:szCs w:val="28"/>
         </w:rPr>
         <w:t xml:space="preserve">6. Тестування адаптивності</w:t>
       </w:r>
@@ -1472,47 +1498,16 @@
     </w:p>
     <w:p>
       <w:pPr>
-        <w:spacing w:after="120" w:line="360"/>
-        <w:jc w:val="both"/>
-      </w:pPr>
-      <w:r>
-        <w:rPr>
-          <w:rFonts w:ascii="Times New Roman" w:cs="Times New Roman" w:eastAsia="Times New Roman" w:hAnsi="Times New Roman"/>
-          <w:sz w:val="28"/>
-          <w:szCs w:val="28"/>
-        </w:rPr>
-        <w:t xml:space="preserve"/>
-      </w:r>
-    </w:p>
-    <w:p>
-      <w:pPr>
-        <w:spacing w:after="120" w:line="360"/>
-        <w:jc w:val="center"/>
-      </w:pPr>
-      <w:r>
-        <w:rPr>
-          <w:rFonts w:ascii="Times New Roman" w:cs="Times New Roman" w:eastAsia="Times New Roman" w:hAnsi="Times New Roman"/>
-          <w:i/>
-          <w:iCs/>
-          <w:color w:val="999999"/>
-          <w:sz w:val="24"/>
-          <w:szCs w:val="24"/>
-        </w:rPr>
-        <w:t xml:space="preserve">(Скріншоти додати перед здачею)</w:t>
-      </w:r>
-    </w:p>
-    <w:p>
-      <w:pPr>
-        <w:pStyle w:val="Heading2"/>
-        <w:spacing w:after="160" w:before="240"/>
-      </w:pPr>
-      <w:r>
-        <w:rPr>
-          <w:rFonts w:ascii="Times New Roman" w:cs="Times New Roman" w:eastAsia="Times New Roman" w:hAnsi="Times New Roman"/>
-          <w:b/>
-          <w:bCs/>
-          <w:sz w:val="32"/>
-          <w:szCs w:val="32"/>
+        <w:spacing w:after="80" w:line="360"/>
+        <w:jc w:val="both"/>
+      </w:pPr>
+      <w:r>
+        <w:rPr>
+          <w:rFonts w:ascii="Times New Roman" w:cs="Times New Roman" w:eastAsia="Times New Roman" w:hAnsi="Times New Roman"/>
+          <w:b/>
+          <w:bCs/>
+          <w:sz w:val="28"/>
+          <w:szCs w:val="28"/>
         </w:rPr>
         <w:t xml:space="preserve">7. Перевірка відповідності вимогам</w:t>
       </w:r>
@@ -1862,7 +1857,7 @@
                 <w:sz w:val="24"/>
                 <w:szCs w:val="24"/>
               </w:rPr>
-              <w:t xml:space="preserve">Виконано: styles.css (372 рядки)</w:t>
+              <w:t xml:space="preserve">Виконано: styles.css</w:t>
             </w:r>
           </w:p>
         </w:tc>
@@ -1966,16 +1961,30 @@
     </w:tbl>
     <w:p>
       <w:pPr>
-        <w:pStyle w:val="Heading1"/>
-        <w:spacing w:after="200" w:before="300"/>
-      </w:pPr>
-      <w:r>
-        <w:rPr>
-          <w:rFonts w:ascii="Times New Roman" w:cs="Times New Roman" w:eastAsia="Times New Roman" w:hAnsi="Times New Roman"/>
-          <w:b/>
-          <w:bCs/>
-          <w:sz w:val="36"/>
-          <w:szCs w:val="36"/>
+        <w:spacing w:after="120" w:line="360"/>
+        <w:jc w:val="both"/>
+      </w:pPr>
+      <w:r>
+        <w:rPr>
+          <w:rFonts w:ascii="Times New Roman" w:cs="Times New Roman" w:eastAsia="Times New Roman" w:hAnsi="Times New Roman"/>
+          <w:sz w:val="28"/>
+          <w:szCs w:val="28"/>
+        </w:rPr>
+        <w:t xml:space="preserve"/>
+      </w:r>
+    </w:p>
+    <w:p>
+      <w:pPr>
+        <w:spacing w:after="160" w:line="360"/>
+        <w:jc w:val="both"/>
+      </w:pPr>
+      <w:r>
+        <w:rPr>
+          <w:rFonts w:ascii="Times New Roman" w:cs="Times New Roman" w:eastAsia="Times New Roman" w:hAnsi="Times New Roman"/>
+          <w:b/>
+          <w:bCs/>
+          <w:sz w:val="32"/>
+          <w:szCs w:val="32"/>
         </w:rPr>
         <w:t xml:space="preserve">Висновок</w:t>
       </w:r>
@@ -2008,36 +2017,6 @@
           <w:szCs w:val="28"/>
         </w:rPr>
         <w:t xml:space="preserve">Під час роботи засвоєно основи HTML5 (семантичні теги, структура документа, таблиці, зображення з alt-атрибутами), CSS3 (CSS-змінні, градієнти, анімації @keyframes, transitions, hover-ефекти, медіа-запити для адаптивного дизайну) та фреймворку Bootstrap 5 (сіткова система container/row/col, навігаційна панель navbar з burger-меню, картки card, стилізовані таблиці table-striped/table-hover, утиліти для відступів і типографіки).</w:t>
-      </w:r>
-    </w:p>
-    <w:p>
-      <w:pPr>
-        <w:spacing w:after="120" w:line="360"/>
-        <w:ind w:firstLine="720"/>
-        <w:jc w:val="both"/>
-      </w:pPr>
-      <w:r>
-        <w:rPr>
-          <w:rFonts w:ascii="Times New Roman" w:cs="Times New Roman" w:eastAsia="Times New Roman" w:hAnsi="Times New Roman"/>
-          <w:sz w:val="28"/>
-          <w:szCs w:val="28"/>
-        </w:rPr>
-        <w:t xml:space="preserve">Реалізовано повнофункціональний односторінковий сайт, що відповідає усім вимогам завдання: валідна HTML5-структура з семантичними тегами, адаптивна навігація з 4 розділами, детальний опис об'єкта (3 абзаци), таблиця з 10 технічними параметрами, 3 зображення (включно з SVG однолінійною електричною схемою), Bootstrap-компоненти, власні CSS-стилі (372 рядки) з анімаціями та тематичною кольоровою схемою, адаптивний дизайн для desktop/tablet/mobile, контактна інформація у футері.</w:t>
-      </w:r>
-    </w:p>
-    <w:p>
-      <w:pPr>
-        <w:spacing w:after="120" w:line="360"/>
-        <w:ind w:firstLine="720"/>
-        <w:jc w:val="both"/>
-      </w:pPr>
-      <w:r>
-        <w:rPr>
-          <w:rFonts w:ascii="Times New Roman" w:cs="Times New Roman" w:eastAsia="Times New Roman" w:hAnsi="Times New Roman"/>
-          <w:sz w:val="28"/>
-          <w:szCs w:val="28"/>
-        </w:rPr>
-        <w:t xml:space="preserve">Код проєкту розміщено у GitHub-репозиторії та організовано з дотриманням стандартної файлової структури веб-проєкту.</w:t>
       </w:r>
     </w:p>
     <w:sectPr>
@@ -2251,11 +2230,9 @@
     <w:next w:val="Normal"/>
     <w:qFormat/>
     <w:rPr>
-      <w:rFonts w:ascii="Times New Roman" w:cs="Times New Roman" w:eastAsia="Times New Roman" w:hAnsi="Times New Roman"/>
-      <w:b/>
-      <w:bCs/>
-      <w:sz w:val="36"/>
-      <w:szCs w:val="36"/>
+      <w:color w:val="2E74B5"/>
+      <w:sz w:val="32"/>
+      <w:szCs w:val="32"/>
     </w:rPr>
   </w:style>
   <w:style w:type="paragraph" w:styleId="Heading2">
@@ -2264,11 +2241,9 @@
     <w:next w:val="Normal"/>
     <w:qFormat/>
     <w:rPr>
-      <w:rFonts w:ascii="Times New Roman" w:cs="Times New Roman" w:eastAsia="Times New Roman" w:hAnsi="Times New Roman"/>
-      <w:b/>
-      <w:bCs/>
-      <w:sz w:val="32"/>
-      <w:szCs w:val="32"/>
+      <w:color w:val="2E74B5"/>
+      <w:sz w:val="26"/>
+      <w:szCs w:val="26"/>
     </w:rPr>
   </w:style>
   <w:style w:type="paragraph" w:styleId="Heading3">

</xml_diff>

<commit_message>
feat(Web/PR1): add screenshots and images to report
</commit_message>
<xml_diff>
--- a/Year-2/Semester-2/Web/PR/PR1/Звіт_ПР1.docx
+++ b/Year-2/Semester-2/Web/PR/PR1/Звіт_ПР1.docx
@@ -1347,6 +1347,68 @@
     </w:p>
     <w:p>
       <w:pPr>
+        <w:spacing w:after="40" w:line="360"/>
+        <w:jc w:val="center"/>
+      </w:pPr>
+      <w:r>
+        <w:drawing>
+          <wp:inline distT="0" distB="0" distL="0" distR="0">
+            <wp:extent cx="4286250" cy="2857500"/>
+            <wp:effectExtent t="0" r="0" b="0" l="0"/>
+            <wp:docPr id="1" name="" descr="" title=""/>
+            <wp:cNvGraphicFramePr>
+              <a:graphicFrameLocks xmlns:a="http://schemas.openxmlformats.org/drawingml/2006/main" noChangeAspect="1"/>
+            </wp:cNvGraphicFramePr>
+            <a:graphic xmlns:a="http://schemas.openxmlformats.org/drawingml/2006/main">
+              <a:graphicData uri="http://schemas.openxmlformats.org/drawingml/2006/picture">
+                <pic:pic xmlns:pic="http://schemas.openxmlformats.org/drawingml/2006/picture">
+                  <pic:nvPicPr>
+                    <pic:cNvPr id="0" name="" descr=""/>
+                    <pic:cNvPicPr>
+                      <a:picLocks noChangeAspect="1" noChangeArrowheads="1"/>
+                    </pic:cNvPicPr>
+                  </pic:nvPicPr>
+                  <pic:blipFill>
+                    <a:blip r:embed="rId7" cstate="none"/>
+                    <a:srcRect/>
+                    <a:stretch>
+                      <a:fillRect/>
+                    </a:stretch>
+                  </pic:blipFill>
+                  <pic:spPr bwMode="auto">
+                    <a:xfrm>
+                      <a:off x="0" y="0"/>
+                      <a:ext cx="4286250" cy="2857500"/>
+                    </a:xfrm>
+                    <a:prstGeom prst="rect">
+                      <a:avLst/>
+                    </a:prstGeom>
+                  </pic:spPr>
+                </pic:pic>
+              </a:graphicData>
+            </a:graphic>
+          </wp:inline>
+        </w:drawing>
+      </w:r>
+    </w:p>
+    <w:p>
+      <w:pPr>
+        <w:spacing w:after="120" w:line="360"/>
+        <w:jc w:val="center"/>
+      </w:pPr>
+      <w:r>
+        <w:rPr>
+          <w:rFonts w:ascii="Times New Roman" w:cs="Times New Roman" w:eastAsia="Times New Roman" w:hAnsi="Times New Roman"/>
+          <w:i/>
+          <w:iCs/>
+          <w:sz w:val="24"/>
+          <w:szCs w:val="24"/>
+        </w:rPr>
+        <w:t xml:space="preserve">Рис. 1. Загальний вигляд ВЕС «Приазовська»</w:t>
+      </w:r>
+    </w:p>
+    <w:p>
+      <w:pPr>
         <w:spacing w:after="120" w:line="360"/>
         <w:jc w:val="both"/>
       </w:pPr>
@@ -1371,6 +1433,68 @@
     </w:p>
     <w:p>
       <w:pPr>
+        <w:spacing w:after="40" w:line="360"/>
+        <w:jc w:val="center"/>
+      </w:pPr>
+      <w:r>
+        <w:drawing>
+          <wp:inline distT="0" distB="0" distL="0" distR="0">
+            <wp:extent cx="4286250" cy="2857500"/>
+            <wp:effectExtent t="0" r="0" b="0" l="0"/>
+            <wp:docPr id="1" name="" descr="" title=""/>
+            <wp:cNvGraphicFramePr>
+              <a:graphicFrameLocks xmlns:a="http://schemas.openxmlformats.org/drawingml/2006/main" noChangeAspect="1"/>
+            </wp:cNvGraphicFramePr>
+            <a:graphic xmlns:a="http://schemas.openxmlformats.org/drawingml/2006/main">
+              <a:graphicData uri="http://schemas.openxmlformats.org/drawingml/2006/picture">
+                <pic:pic xmlns:pic="http://schemas.openxmlformats.org/drawingml/2006/picture">
+                  <pic:nvPicPr>
+                    <pic:cNvPr id="0" name="" descr=""/>
+                    <pic:cNvPicPr>
+                      <a:picLocks noChangeAspect="1" noChangeArrowheads="1"/>
+                    </pic:cNvPicPr>
+                  </pic:nvPicPr>
+                  <pic:blipFill>
+                    <a:blip r:embed="rId8" cstate="none"/>
+                    <a:srcRect/>
+                    <a:stretch>
+                      <a:fillRect/>
+                    </a:stretch>
+                  </pic:blipFill>
+                  <pic:spPr bwMode="auto">
+                    <a:xfrm>
+                      <a:off x="0" y="0"/>
+                      <a:ext cx="4286250" cy="2857500"/>
+                    </a:xfrm>
+                    <a:prstGeom prst="rect">
+                      <a:avLst/>
+                    </a:prstGeom>
+                  </pic:spPr>
+                </pic:pic>
+              </a:graphicData>
+            </a:graphic>
+          </wp:inline>
+        </w:drawing>
+      </w:r>
+    </w:p>
+    <w:p>
+      <w:pPr>
+        <w:spacing w:after="120" w:line="360"/>
+        <w:jc w:val="center"/>
+      </w:pPr>
+      <w:r>
+        <w:rPr>
+          <w:rFonts w:ascii="Times New Roman" w:cs="Times New Roman" w:eastAsia="Times New Roman" w:hAnsi="Times New Roman"/>
+          <w:i/>
+          <w:iCs/>
+          <w:sz w:val="24"/>
+          <w:szCs w:val="24"/>
+        </w:rPr>
+        <w:t xml:space="preserve">Рис. 2. Розташування вітрових турбін</w:t>
+      </w:r>
+    </w:p>
+    <w:p>
+      <w:pPr>
         <w:spacing w:after="120" w:line="360"/>
         <w:jc w:val="both"/>
       </w:pPr>
@@ -1395,6 +1519,68 @@
     </w:p>
     <w:p>
       <w:pPr>
+        <w:spacing w:after="40" w:line="360"/>
+        <w:jc w:val="center"/>
+      </w:pPr>
+      <w:r>
+        <w:drawing>
+          <wp:inline distT="0" distB="0" distL="0" distR="0">
+            <wp:extent cx="3810000" cy="5372100"/>
+            <wp:effectExtent t="0" r="0" b="0" l="0"/>
+            <wp:docPr id="1" name="" descr="" title=""/>
+            <wp:cNvGraphicFramePr>
+              <a:graphicFrameLocks xmlns:a="http://schemas.openxmlformats.org/drawingml/2006/main" noChangeAspect="1"/>
+            </wp:cNvGraphicFramePr>
+            <a:graphic xmlns:a="http://schemas.openxmlformats.org/drawingml/2006/main">
+              <a:graphicData uri="http://schemas.openxmlformats.org/drawingml/2006/picture">
+                <pic:pic xmlns:pic="http://schemas.openxmlformats.org/drawingml/2006/picture">
+                  <pic:nvPicPr>
+                    <pic:cNvPr id="0" name="" descr=""/>
+                    <pic:cNvPicPr>
+                      <a:picLocks noChangeAspect="1" noChangeArrowheads="1"/>
+                    </pic:cNvPicPr>
+                  </pic:nvPicPr>
+                  <pic:blipFill>
+                    <a:blip r:embed="rId9" cstate="none"/>
+                    <a:srcRect/>
+                    <a:stretch>
+                      <a:fillRect/>
+                    </a:stretch>
+                  </pic:blipFill>
+                  <pic:spPr bwMode="auto">
+                    <a:xfrm>
+                      <a:off x="0" y="0"/>
+                      <a:ext cx="3810000" cy="5372100"/>
+                    </a:xfrm>
+                    <a:prstGeom prst="rect">
+                      <a:avLst/>
+                    </a:prstGeom>
+                  </pic:spPr>
+                </pic:pic>
+              </a:graphicData>
+            </a:graphic>
+          </wp:inline>
+        </w:drawing>
+      </w:r>
+    </w:p>
+    <w:p>
+      <w:pPr>
+        <w:spacing w:after="120" w:line="360"/>
+        <w:jc w:val="center"/>
+      </w:pPr>
+      <w:r>
+        <w:rPr>
+          <w:rFonts w:ascii="Times New Roman" w:cs="Times New Roman" w:eastAsia="Times New Roman" w:hAnsi="Times New Roman"/>
+          <w:i/>
+          <w:iCs/>
+          <w:sz w:val="24"/>
+          <w:szCs w:val="24"/>
+        </w:rPr>
+        <w:t xml:space="preserve">Рис. 3. Однолінійна електрична схема ВЕС «Приазовська»</w:t>
+      </w:r>
+    </w:p>
+    <w:p>
+      <w:pPr>
         <w:spacing w:after="120" w:line="360"/>
         <w:ind w:firstLine="720"/>
         <w:jc w:val="both"/>
@@ -1406,21 +1592,6 @@
           <w:szCs w:val="28"/>
         </w:rPr>
         <w:t xml:space="preserve">Опис об'єкта складається з 3 абзаців: історія введення в експлуатацію (2018–2019), технічна характеристика обладнання (50 турбін Vestas V117), екологічний вплив (370 000 т CO₂/рік). Таблиця технічних параметрів містить 10 рядків.</w:t>
-      </w:r>
-    </w:p>
-    <w:p>
-      <w:pPr>
-        <w:spacing w:after="120" w:line="360"/>
-        <w:ind w:firstLine="720"/>
-        <w:jc w:val="both"/>
-      </w:pPr>
-      <w:r>
-        <w:rPr>
-          <w:rFonts w:ascii="Times New Roman" w:cs="Times New Roman" w:eastAsia="Times New Roman" w:hAnsi="Times New Roman"/>
-          <w:sz w:val="28"/>
-          <w:szCs w:val="28"/>
-        </w:rPr>
-        <w:t xml:space="preserve">Контактна інформація включає: адресу, телефон диспетчерської, відділ ТО, email, веб-сайт. Дублюється у секції «Контакти» та у футері.</w:t>
       </w:r>
     </w:p>
     <w:p>
@@ -1436,7 +1607,7 @@
           <w:sz w:val="28"/>
           <w:szCs w:val="28"/>
         </w:rPr>
-        <w:t xml:space="preserve">6. Тестування адаптивності</w:t>
+        <w:t xml:space="preserve">6. Результат виконання</w:t>
       </w:r>
     </w:p>
     <w:p>
@@ -1451,49 +1622,131 @@
           <w:sz w:val="28"/>
           <w:szCs w:val="28"/>
         </w:rPr>
-        <w:t xml:space="preserve">Сайт перевірено на 3 розмірах екрана:</w:t>
-      </w:r>
-    </w:p>
-    <w:p>
-      <w:pPr>
-        <w:spacing w:after="40" w:line="360"/>
-        <w:jc w:val="both"/>
-      </w:pPr>
-      <w:r>
-        <w:rPr>
-          <w:rFonts w:ascii="Times New Roman" w:cs="Times New Roman" w:eastAsia="Times New Roman" w:hAnsi="Times New Roman"/>
-          <w:sz w:val="28"/>
-          <w:szCs w:val="28"/>
-        </w:rPr>
-        <w:t xml:space="preserve">– Desktop (1920×1080): повне горизонтальне меню, двоколонкова верстка, 3 картки в ряд</w:t>
-      </w:r>
-    </w:p>
-    <w:p>
-      <w:pPr>
-        <w:spacing w:after="40" w:line="360"/>
-        <w:jc w:val="both"/>
-      </w:pPr>
-      <w:r>
-        <w:rPr>
-          <w:rFonts w:ascii="Times New Roman" w:cs="Times New Roman" w:eastAsia="Times New Roman" w:hAnsi="Times New Roman"/>
-          <w:sz w:val="28"/>
-          <w:szCs w:val="28"/>
-        </w:rPr>
-        <w:t xml:space="preserve">– Tablet (768×1024): зменшені заголовки, зберігається горизонтальна навігація</w:t>
-      </w:r>
-    </w:p>
-    <w:p>
-      <w:pPr>
-        <w:spacing w:after="40" w:line="360"/>
-        <w:jc w:val="both"/>
-      </w:pPr>
-      <w:r>
-        <w:rPr>
-          <w:rFonts w:ascii="Times New Roman" w:cs="Times New Roman" w:eastAsia="Times New Roman" w:hAnsi="Times New Roman"/>
-          <w:sz w:val="28"/>
-          <w:szCs w:val="28"/>
-        </w:rPr>
-        <w:t xml:space="preserve">– Mobile (375×667): burger-меню, одноколонкова верстка, приховані декоративні елементи</w:t>
+        <w:t xml:space="preserve">Загальний вигляд сайту (desktop, 1920×1080):</w:t>
+      </w:r>
+    </w:p>
+    <w:p>
+      <w:pPr>
+        <w:spacing w:after="40" w:line="360"/>
+        <w:jc w:val="center"/>
+      </w:pPr>
+      <w:r>
+        <w:drawing>
+          <wp:inline distT="0" distB="0" distL="0" distR="0">
+            <wp:extent cx="5238750" cy="2943225"/>
+            <wp:effectExtent t="0" r="0" b="0" l="0"/>
+            <wp:docPr id="1" name="" descr="" title=""/>
+            <wp:cNvGraphicFramePr>
+              <a:graphicFrameLocks xmlns:a="http://schemas.openxmlformats.org/drawingml/2006/main" noChangeAspect="1"/>
+            </wp:cNvGraphicFramePr>
+            <a:graphic xmlns:a="http://schemas.openxmlformats.org/drawingml/2006/main">
+              <a:graphicData uri="http://schemas.openxmlformats.org/drawingml/2006/picture">
+                <pic:pic xmlns:pic="http://schemas.openxmlformats.org/drawingml/2006/picture">
+                  <pic:nvPicPr>
+                    <pic:cNvPr id="0" name="" descr=""/>
+                    <pic:cNvPicPr>
+                      <a:picLocks noChangeAspect="1" noChangeArrowheads="1"/>
+                    </pic:cNvPicPr>
+                  </pic:nvPicPr>
+                  <pic:blipFill>
+                    <a:blip r:embed="rId10" cstate="none"/>
+                    <a:srcRect/>
+                    <a:stretch>
+                      <a:fillRect/>
+                    </a:stretch>
+                  </pic:blipFill>
+                  <pic:spPr bwMode="auto">
+                    <a:xfrm>
+                      <a:off x="0" y="0"/>
+                      <a:ext cx="5238750" cy="2943225"/>
+                    </a:xfrm>
+                    <a:prstGeom prst="rect">
+                      <a:avLst/>
+                    </a:prstGeom>
+                  </pic:spPr>
+                </pic:pic>
+              </a:graphicData>
+            </a:graphic>
+          </wp:inline>
+        </w:drawing>
+      </w:r>
+    </w:p>
+    <w:p>
+      <w:pPr>
+        <w:spacing w:after="120" w:line="360"/>
+        <w:jc w:val="center"/>
+      </w:pPr>
+      <w:r>
+        <w:rPr>
+          <w:rFonts w:ascii="Times New Roman" w:cs="Times New Roman" w:eastAsia="Times New Roman" w:hAnsi="Times New Roman"/>
+          <w:i/>
+          <w:iCs/>
+          <w:sz w:val="24"/>
+          <w:szCs w:val="24"/>
+        </w:rPr>
+        <w:t xml:space="preserve">Рис. 4. Hero-секція сайту (desktop)</w:t>
+      </w:r>
+    </w:p>
+    <w:p>
+      <w:pPr>
+        <w:spacing w:after="40" w:line="360"/>
+        <w:jc w:val="center"/>
+      </w:pPr>
+      <w:r>
+        <w:drawing>
+          <wp:inline distT="0" distB="0" distL="0" distR="0">
+            <wp:extent cx="5238750" cy="13430250"/>
+            <wp:effectExtent t="0" r="0" b="0" l="0"/>
+            <wp:docPr id="1" name="" descr="" title=""/>
+            <wp:cNvGraphicFramePr>
+              <a:graphicFrameLocks xmlns:a="http://schemas.openxmlformats.org/drawingml/2006/main" noChangeAspect="1"/>
+            </wp:cNvGraphicFramePr>
+            <a:graphic xmlns:a="http://schemas.openxmlformats.org/drawingml/2006/main">
+              <a:graphicData uri="http://schemas.openxmlformats.org/drawingml/2006/picture">
+                <pic:pic xmlns:pic="http://schemas.openxmlformats.org/drawingml/2006/picture">
+                  <pic:nvPicPr>
+                    <pic:cNvPr id="0" name="" descr=""/>
+                    <pic:cNvPicPr>
+                      <a:picLocks noChangeAspect="1" noChangeArrowheads="1"/>
+                    </pic:cNvPicPr>
+                  </pic:nvPicPr>
+                  <pic:blipFill>
+                    <a:blip r:embed="rId11" cstate="none"/>
+                    <a:srcRect/>
+                    <a:stretch>
+                      <a:fillRect/>
+                    </a:stretch>
+                  </pic:blipFill>
+                  <pic:spPr bwMode="auto">
+                    <a:xfrm>
+                      <a:off x="0" y="0"/>
+                      <a:ext cx="5238750" cy="13430250"/>
+                    </a:xfrm>
+                    <a:prstGeom prst="rect">
+                      <a:avLst/>
+                    </a:prstGeom>
+                  </pic:spPr>
+                </pic:pic>
+              </a:graphicData>
+            </a:graphic>
+          </wp:inline>
+        </w:drawing>
+      </w:r>
+    </w:p>
+    <w:p>
+      <w:pPr>
+        <w:spacing w:after="120" w:line="360"/>
+        <w:jc w:val="center"/>
+      </w:pPr>
+      <w:r>
+        <w:rPr>
+          <w:rFonts w:ascii="Times New Roman" w:cs="Times New Roman" w:eastAsia="Times New Roman" w:hAnsi="Times New Roman"/>
+          <w:i/>
+          <w:iCs/>
+          <w:sz w:val="24"/>
+          <w:szCs w:val="24"/>
+        </w:rPr>
+        <w:t xml:space="preserve">Рис. 5. Повна сторінка сайту (desktop, 1920×1080)</w:t>
       </w:r>
     </w:p>
     <w:p>
@@ -1509,7 +1762,218 @@
           <w:sz w:val="28"/>
           <w:szCs w:val="28"/>
         </w:rPr>
-        <w:t xml:space="preserve">7. Перевірка відповідності вимогам</w:t>
+        <w:t xml:space="preserve">7. Тестування адаптивності</w:t>
+      </w:r>
+    </w:p>
+    <w:p>
+      <w:pPr>
+        <w:spacing w:after="40" w:line="360"/>
+        <w:ind w:firstLine="720"/>
+        <w:jc w:val="both"/>
+      </w:pPr>
+      <w:r>
+        <w:rPr>
+          <w:rFonts w:ascii="Times New Roman" w:cs="Times New Roman" w:eastAsia="Times New Roman" w:hAnsi="Times New Roman"/>
+          <w:sz w:val="28"/>
+          <w:szCs w:val="28"/>
+        </w:rPr>
+        <w:t xml:space="preserve">Сайт перевірено на 3 розмірах екрана:</w:t>
+      </w:r>
+    </w:p>
+    <w:p>
+      <w:pPr>
+        <w:spacing w:after="40" w:line="360"/>
+        <w:jc w:val="both"/>
+      </w:pPr>
+      <w:r>
+        <w:rPr>
+          <w:rFonts w:ascii="Times New Roman" w:cs="Times New Roman" w:eastAsia="Times New Roman" w:hAnsi="Times New Roman"/>
+          <w:sz w:val="28"/>
+          <w:szCs w:val="28"/>
+        </w:rPr>
+        <w:t xml:space="preserve">– Desktop (1920×1080): повне горизонтальне меню, двоколонкова верстка, 3 картки в ряд</w:t>
+      </w:r>
+    </w:p>
+    <w:p>
+      <w:pPr>
+        <w:spacing w:after="40" w:line="360"/>
+        <w:jc w:val="both"/>
+      </w:pPr>
+      <w:r>
+        <w:rPr>
+          <w:rFonts w:ascii="Times New Roman" w:cs="Times New Roman" w:eastAsia="Times New Roman" w:hAnsi="Times New Roman"/>
+          <w:sz w:val="28"/>
+          <w:szCs w:val="28"/>
+        </w:rPr>
+        <w:t xml:space="preserve">– Tablet (768×1024): зменшені заголовки, зберігається горизонтальна навігація</w:t>
+      </w:r>
+    </w:p>
+    <w:p>
+      <w:pPr>
+        <w:spacing w:after="40" w:line="360"/>
+        <w:jc w:val="both"/>
+      </w:pPr>
+      <w:r>
+        <w:rPr>
+          <w:rFonts w:ascii="Times New Roman" w:cs="Times New Roman" w:eastAsia="Times New Roman" w:hAnsi="Times New Roman"/>
+          <w:sz w:val="28"/>
+          <w:szCs w:val="28"/>
+        </w:rPr>
+        <w:t xml:space="preserve">– Mobile (375×667): burger-меню, одноколонкова верстка, приховані декоративні елементи</w:t>
+      </w:r>
+    </w:p>
+    <w:p>
+      <w:pPr>
+        <w:spacing w:after="120" w:line="360"/>
+        <w:jc w:val="both"/>
+      </w:pPr>
+      <w:r>
+        <w:rPr>
+          <w:rFonts w:ascii="Times New Roman" w:cs="Times New Roman" w:eastAsia="Times New Roman" w:hAnsi="Times New Roman"/>
+          <w:sz w:val="28"/>
+          <w:szCs w:val="28"/>
+        </w:rPr>
+        <w:t xml:space="preserve"/>
+      </w:r>
+    </w:p>
+    <w:p>
+      <w:pPr>
+        <w:spacing w:after="40" w:line="360"/>
+        <w:jc w:val="center"/>
+      </w:pPr>
+      <w:r>
+        <w:drawing>
+          <wp:inline distT="0" distB="0" distL="0" distR="0">
+            <wp:extent cx="3333750" cy="24584025"/>
+            <wp:effectExtent t="0" r="0" b="0" l="0"/>
+            <wp:docPr id="1" name="" descr="" title=""/>
+            <wp:cNvGraphicFramePr>
+              <a:graphicFrameLocks xmlns:a="http://schemas.openxmlformats.org/drawingml/2006/main" noChangeAspect="1"/>
+            </wp:cNvGraphicFramePr>
+            <a:graphic xmlns:a="http://schemas.openxmlformats.org/drawingml/2006/main">
+              <a:graphicData uri="http://schemas.openxmlformats.org/drawingml/2006/picture">
+                <pic:pic xmlns:pic="http://schemas.openxmlformats.org/drawingml/2006/picture">
+                  <pic:nvPicPr>
+                    <pic:cNvPr id="0" name="" descr=""/>
+                    <pic:cNvPicPr>
+                      <a:picLocks noChangeAspect="1" noChangeArrowheads="1"/>
+                    </pic:cNvPicPr>
+                  </pic:nvPicPr>
+                  <pic:blipFill>
+                    <a:blip r:embed="rId12" cstate="none"/>
+                    <a:srcRect/>
+                    <a:stretch>
+                      <a:fillRect/>
+                    </a:stretch>
+                  </pic:blipFill>
+                  <pic:spPr bwMode="auto">
+                    <a:xfrm>
+                      <a:off x="0" y="0"/>
+                      <a:ext cx="3333750" cy="24584025"/>
+                    </a:xfrm>
+                    <a:prstGeom prst="rect">
+                      <a:avLst/>
+                    </a:prstGeom>
+                  </pic:spPr>
+                </pic:pic>
+              </a:graphicData>
+            </a:graphic>
+          </wp:inline>
+        </w:drawing>
+      </w:r>
+    </w:p>
+    <w:p>
+      <w:pPr>
+        <w:spacing w:after="120" w:line="360"/>
+        <w:jc w:val="center"/>
+      </w:pPr>
+      <w:r>
+        <w:rPr>
+          <w:rFonts w:ascii="Times New Roman" w:cs="Times New Roman" w:eastAsia="Times New Roman" w:hAnsi="Times New Roman"/>
+          <w:i/>
+          <w:iCs/>
+          <w:sz w:val="24"/>
+          <w:szCs w:val="24"/>
+        </w:rPr>
+        <w:t xml:space="preserve">Рис. 6. Вигляд сайту на планшеті (768×1024)</w:t>
+      </w:r>
+    </w:p>
+    <w:p>
+      <w:pPr>
+        <w:spacing w:after="40" w:line="360"/>
+        <w:jc w:val="center"/>
+      </w:pPr>
+      <w:r>
+        <w:drawing>
+          <wp:inline distT="0" distB="0" distL="0" distR="0">
+            <wp:extent cx="2095500" cy="37318950"/>
+            <wp:effectExtent t="0" r="0" b="0" l="0"/>
+            <wp:docPr id="1" name="" descr="" title=""/>
+            <wp:cNvGraphicFramePr>
+              <a:graphicFrameLocks xmlns:a="http://schemas.openxmlformats.org/drawingml/2006/main" noChangeAspect="1"/>
+            </wp:cNvGraphicFramePr>
+            <a:graphic xmlns:a="http://schemas.openxmlformats.org/drawingml/2006/main">
+              <a:graphicData uri="http://schemas.openxmlformats.org/drawingml/2006/picture">
+                <pic:pic xmlns:pic="http://schemas.openxmlformats.org/drawingml/2006/picture">
+                  <pic:nvPicPr>
+                    <pic:cNvPr id="0" name="" descr=""/>
+                    <pic:cNvPicPr>
+                      <a:picLocks noChangeAspect="1" noChangeArrowheads="1"/>
+                    </pic:cNvPicPr>
+                  </pic:nvPicPr>
+                  <pic:blipFill>
+                    <a:blip r:embed="rId13" cstate="none"/>
+                    <a:srcRect/>
+                    <a:stretch>
+                      <a:fillRect/>
+                    </a:stretch>
+                  </pic:blipFill>
+                  <pic:spPr bwMode="auto">
+                    <a:xfrm>
+                      <a:off x="0" y="0"/>
+                      <a:ext cx="2095500" cy="37318950"/>
+                    </a:xfrm>
+                    <a:prstGeom prst="rect">
+                      <a:avLst/>
+                    </a:prstGeom>
+                  </pic:spPr>
+                </pic:pic>
+              </a:graphicData>
+            </a:graphic>
+          </wp:inline>
+        </w:drawing>
+      </w:r>
+    </w:p>
+    <w:p>
+      <w:pPr>
+        <w:spacing w:after="120" w:line="360"/>
+        <w:jc w:val="center"/>
+      </w:pPr>
+      <w:r>
+        <w:rPr>
+          <w:rFonts w:ascii="Times New Roman" w:cs="Times New Roman" w:eastAsia="Times New Roman" w:hAnsi="Times New Roman"/>
+          <w:i/>
+          <w:iCs/>
+          <w:sz w:val="24"/>
+          <w:szCs w:val="24"/>
+        </w:rPr>
+        <w:t xml:space="preserve">Рис. 7. Вигляд сайту на мобільному (375×667)</w:t>
+      </w:r>
+    </w:p>
+    <w:p>
+      <w:pPr>
+        <w:spacing w:after="80" w:line="360"/>
+        <w:jc w:val="both"/>
+      </w:pPr>
+      <w:r>
+        <w:rPr>
+          <w:rFonts w:ascii="Times New Roman" w:cs="Times New Roman" w:eastAsia="Times New Roman" w:hAnsi="Times New Roman"/>
+          <w:b/>
+          <w:bCs/>
+          <w:sz w:val="28"/>
+          <w:szCs w:val="28"/>
+        </w:rPr>
+        <w:t xml:space="preserve">8. Перевірка відповідності вимогам</w:t>
       </w:r>
     </w:p>
     <w:tbl>

</xml_diff>

<commit_message>
fix(Web/PR1): replace em dashes with hyphens in report
</commit_message>
<xml_diff>
--- a/Year-2/Semester-2/Web/PR/PR1/Звіт_ПР1.docx
+++ b/Year-2/Semester-2/Web/PR/PR1/Звіт_ПР1.docx
@@ -579,7 +579,7 @@
           <w:sz w:val="28"/>
           <w:szCs w:val="28"/>
         </w:rPr>
-        <w:t xml:space="preserve">4. Написати детальний опис об'єкта (історія, призначення, особливості) — мінімум 2 абзаци</w:t>
+        <w:t xml:space="preserve">4. Написати детальний опис об'єкта (історія, призначення, особливості) - мінімум 2 абзаци</w:t>
       </w:r>
     </w:p>
     <w:p>
@@ -687,7 +687,7 @@
           <w:sz w:val="28"/>
           <w:szCs w:val="28"/>
         </w:rPr>
-        <w:t xml:space="preserve">тип — вітрова електростанція, потужність — 150 МВт, напруга — 0,69/35 кВ, місцезнаходження — Запорізька обл.</w:t>
+        <w:t xml:space="preserve">тип - вітрова електростанція, потужність - 150 МВт, напруга - 0,69/35 кВ, місцезнаходження - Запорізька обл.</w:t>
       </w:r>
     </w:p>
     <w:p>
@@ -748,7 +748,7 @@
           <w:sz w:val="28"/>
           <w:szCs w:val="28"/>
         </w:rPr>
-        <w:t xml:space="preserve">Обрано варіант 15 — Вітрова станція «Приазовська». Проведено аналіз типової структури ВЕС: принцип роботи, основне обладнання (50 турбін Vestas V117-3.45 MW, трансформатори 0,69/35 кВ, кабельна мережа, підстанція 35/110 кВ), режим експлуатації.</w:t>
+        <w:t xml:space="preserve">Обрано варіант 15 - Вітрова станція «Приазовська». Проведено аналіз типової структури ВЕС: принцип роботи, основне обладнання (50 турбін Vestas V117-3.45 MW, трансформатори 0,69/35 кВ, кабельна мережа, підстанція 35/110 кВ), режим експлуатації.</w:t>
       </w:r>
     </w:p>
     <w:p>
@@ -778,7 +778,7 @@
           <w:sz w:val="28"/>
           <w:szCs w:val="28"/>
         </w:rPr>
-        <w:t xml:space="preserve">Колірна схема обрана тематично: блакитний (#0d6efd) — небо, темно-зелений (#1a6b5a) — природа, аква (#29d9c2) — чиста енергія.</w:t>
+        <w:t xml:space="preserve">Колірна схема обрана тематично: блакитний (#0d6efd) - небо, темно-зелений (#1a6b5a) - природа, аква (#29d9c2) - чиста енергія.</w:t>
       </w:r>
     </w:p>
     <w:p>
@@ -808,7 +808,7 @@
           <w:sz w:val="28"/>
           <w:szCs w:val="28"/>
         </w:rPr>
-        <w:t xml:space="preserve">PR1/index.html — головна сторінка</w:t>
+        <w:t xml:space="preserve">PR1/index.html - головна сторінка</w:t>
       </w:r>
     </w:p>
     <w:p>
@@ -822,7 +822,7 @@
           <w:sz w:val="28"/>
           <w:szCs w:val="28"/>
         </w:rPr>
-        <w:t xml:space="preserve">PR1/styles.css — власні CSS-стилі</w:t>
+        <w:t xml:space="preserve">PR1/styles.css - власні CSS-стилі</w:t>
       </w:r>
     </w:p>
     <w:p>
@@ -836,7 +836,7 @@
           <w:sz w:val="28"/>
           <w:szCs w:val="28"/>
         </w:rPr>
-        <w:t xml:space="preserve">PR1/images/wpp-general.jpg — загальний вигляд ВЕС</w:t>
+        <w:t xml:space="preserve">PR1/images/wpp-general.jpg - загальний вигляд ВЕС</w:t>
       </w:r>
     </w:p>
     <w:p>
@@ -850,7 +850,7 @@
           <w:sz w:val="28"/>
           <w:szCs w:val="28"/>
         </w:rPr>
-        <w:t xml:space="preserve">PR1/images/wpp-layout.jpg — розташування турбін</w:t>
+        <w:t xml:space="preserve">PR1/images/wpp-layout.jpg - розташування турбін</w:t>
       </w:r>
     </w:p>
     <w:p>
@@ -864,7 +864,7 @@
           <w:sz w:val="28"/>
           <w:szCs w:val="28"/>
         </w:rPr>
-        <w:t xml:space="preserve">PR1/images/wpp-scheme.svg — однолінійна електрична схема</w:t>
+        <w:t xml:space="preserve">PR1/images/wpp-scheme.svg - однолінійна електрична схема</w:t>
       </w:r>
     </w:p>
     <w:p>
@@ -878,7 +878,7 @@
           <w:sz w:val="28"/>
           <w:szCs w:val="28"/>
         </w:rPr>
-        <w:t xml:space="preserve">PR1/README.md — опис проєкту</w:t>
+        <w:t xml:space="preserve">PR1/README.md - опис проєкту</w:t>
       </w:r>
     </w:p>
     <w:p>
@@ -938,63 +938,63 @@
           <w:sz w:val="28"/>
           <w:szCs w:val="28"/>
         </w:rPr>
-        <w:t xml:space="preserve">– &lt;nav&gt; — адаптивна навігаційна панель Bootstrap (navbar-expand-lg) з 4 пунктами меню та burger-меню</w:t>
-      </w:r>
-    </w:p>
-    <w:p>
-      <w:pPr>
-        <w:spacing w:after="40" w:line="360"/>
-        <w:jc w:val="both"/>
-      </w:pPr>
-      <w:r>
-        <w:rPr>
-          <w:rFonts w:ascii="Times New Roman" w:cs="Times New Roman" w:eastAsia="Times New Roman" w:hAnsi="Times New Roman"/>
-          <w:sz w:val="28"/>
-          <w:szCs w:val="28"/>
-        </w:rPr>
-        <w:t xml:space="preserve">– &lt;header&gt; — hero-секція з h1 заголовком, lead-підзаголовком та CTA-кнопками</w:t>
-      </w:r>
-    </w:p>
-    <w:p>
-      <w:pPr>
-        <w:spacing w:after="40" w:line="360"/>
-        <w:jc w:val="both"/>
-      </w:pPr>
-      <w:r>
-        <w:rPr>
-          <w:rFonts w:ascii="Times New Roman" w:cs="Times New Roman" w:eastAsia="Times New Roman" w:hAnsi="Times New Roman"/>
-          <w:sz w:val="28"/>
-          <w:szCs w:val="28"/>
-        </w:rPr>
-        <w:t xml:space="preserve">– &lt;main&gt; — основний контент з 5 секціями</w:t>
-      </w:r>
-    </w:p>
-    <w:p>
-      <w:pPr>
-        <w:spacing w:after="40" w:line="360"/>
-        <w:jc w:val="both"/>
-      </w:pPr>
-      <w:r>
-        <w:rPr>
-          <w:rFonts w:ascii="Times New Roman" w:cs="Times New Roman" w:eastAsia="Times New Roman" w:hAnsi="Times New Roman"/>
-          <w:sz w:val="28"/>
-          <w:szCs w:val="28"/>
-        </w:rPr>
-        <w:t xml:space="preserve">– &lt;section&gt; — логічні розділи: about, params, scheme, contacts + stats-bar</w:t>
-      </w:r>
-    </w:p>
-    <w:p>
-      <w:pPr>
-        <w:spacing w:after="40" w:line="360"/>
-        <w:jc w:val="both"/>
-      </w:pPr>
-      <w:r>
-        <w:rPr>
-          <w:rFonts w:ascii="Times New Roman" w:cs="Times New Roman" w:eastAsia="Times New Roman" w:hAnsi="Times New Roman"/>
-          <w:sz w:val="28"/>
-          <w:szCs w:val="28"/>
-        </w:rPr>
-        <w:t xml:space="preserve">– &lt;footer&gt; — нижній колонтитул з контактною інформацією (3-колонковий Bootstrap grid)</w:t>
+        <w:t xml:space="preserve">– &lt;nav&gt; - адаптивна навігаційна панель Bootstrap (navbar-expand-lg) з 4 пунктами меню та burger-меню</w:t>
+      </w:r>
+    </w:p>
+    <w:p>
+      <w:pPr>
+        <w:spacing w:after="40" w:line="360"/>
+        <w:jc w:val="both"/>
+      </w:pPr>
+      <w:r>
+        <w:rPr>
+          <w:rFonts w:ascii="Times New Roman" w:cs="Times New Roman" w:eastAsia="Times New Roman" w:hAnsi="Times New Roman"/>
+          <w:sz w:val="28"/>
+          <w:szCs w:val="28"/>
+        </w:rPr>
+        <w:t xml:space="preserve">– &lt;header&gt; - hero-секція з h1 заголовком, lead-підзаголовком та CTA-кнопками</w:t>
+      </w:r>
+    </w:p>
+    <w:p>
+      <w:pPr>
+        <w:spacing w:after="40" w:line="360"/>
+        <w:jc w:val="both"/>
+      </w:pPr>
+      <w:r>
+        <w:rPr>
+          <w:rFonts w:ascii="Times New Roman" w:cs="Times New Roman" w:eastAsia="Times New Roman" w:hAnsi="Times New Roman"/>
+          <w:sz w:val="28"/>
+          <w:szCs w:val="28"/>
+        </w:rPr>
+        <w:t xml:space="preserve">– &lt;main&gt; - основний контент з 5 секціями</w:t>
+      </w:r>
+    </w:p>
+    <w:p>
+      <w:pPr>
+        <w:spacing w:after="40" w:line="360"/>
+        <w:jc w:val="both"/>
+      </w:pPr>
+      <w:r>
+        <w:rPr>
+          <w:rFonts w:ascii="Times New Roman" w:cs="Times New Roman" w:eastAsia="Times New Roman" w:hAnsi="Times New Roman"/>
+          <w:sz w:val="28"/>
+          <w:szCs w:val="28"/>
+        </w:rPr>
+        <w:t xml:space="preserve">– &lt;section&gt; - логічні розділи: about, params, scheme, contacts + stats-bar</w:t>
+      </w:r>
+    </w:p>
+    <w:p>
+      <w:pPr>
+        <w:spacing w:after="40" w:line="360"/>
+        <w:jc w:val="both"/>
+      </w:pPr>
+      <w:r>
+        <w:rPr>
+          <w:rFonts w:ascii="Times New Roman" w:cs="Times New Roman" w:eastAsia="Times New Roman" w:hAnsi="Times New Roman"/>
+          <w:sz w:val="28"/>
+          <w:szCs w:val="28"/>
+        </w:rPr>
+        <w:t xml:space="preserve">– &lt;footer&gt; - нижній колонтитул з контактною інформацією (3-колонковий Bootstrap grid)</w:t>
       </w:r>
     </w:p>
     <w:p>
@@ -1023,63 +1023,63 @@
           <w:sz w:val="28"/>
           <w:szCs w:val="28"/>
         </w:rPr>
-        <w:t xml:space="preserve">– Navbar — navbar-expand-lg, navbar-dark, collapse, navbar-toggler</w:t>
-      </w:r>
-    </w:p>
-    <w:p>
-      <w:pPr>
-        <w:spacing w:after="40" w:line="360"/>
-        <w:jc w:val="both"/>
-      </w:pPr>
-      <w:r>
-        <w:rPr>
-          <w:rFonts w:ascii="Times New Roman" w:cs="Times New Roman" w:eastAsia="Times New Roman" w:hAnsi="Times New Roman"/>
-          <w:sz w:val="28"/>
-          <w:szCs w:val="28"/>
-        </w:rPr>
-        <w:t xml:space="preserve">– Grid — container, row, col-lg-7/5, col-md-4/6/3, col-6</w:t>
-      </w:r>
-    </w:p>
-    <w:p>
-      <w:pPr>
-        <w:spacing w:after="40" w:line="360"/>
-        <w:jc w:val="both"/>
-      </w:pPr>
-      <w:r>
-        <w:rPr>
-          <w:rFonts w:ascii="Times New Roman" w:cs="Times New Roman" w:eastAsia="Times New Roman" w:hAnsi="Times New Roman"/>
-          <w:sz w:val="28"/>
-          <w:szCs w:val="28"/>
-        </w:rPr>
-        <w:t xml:space="preserve">– Cards — card, card-body, card-title, card-text, h-100</w:t>
-      </w:r>
-    </w:p>
-    <w:p>
-      <w:pPr>
-        <w:spacing w:after="40" w:line="360"/>
-        <w:jc w:val="both"/>
-      </w:pPr>
-      <w:r>
-        <w:rPr>
-          <w:rFonts w:ascii="Times New Roman" w:cs="Times New Roman" w:eastAsia="Times New Roman" w:hAnsi="Times New Roman"/>
-          <w:sz w:val="28"/>
-          <w:szCs w:val="28"/>
-        </w:rPr>
-        <w:t xml:space="preserve">– Table — table-striped, table-hover, table-responsive, align-middle</w:t>
-      </w:r>
-    </w:p>
-    <w:p>
-      <w:pPr>
-        <w:spacing w:after="40" w:line="360"/>
-        <w:jc w:val="both"/>
-      </w:pPr>
-      <w:r>
-        <w:rPr>
-          <w:rFonts w:ascii="Times New Roman" w:cs="Times New Roman" w:eastAsia="Times New Roman" w:hAnsi="Times New Roman"/>
-          <w:sz w:val="28"/>
-          <w:szCs w:val="28"/>
-        </w:rPr>
-        <w:t xml:space="preserve">– Utilities — mt-4, mb-5, py-4, text-center, fw-bold, lead, btn-lg, btn-outline-light</w:t>
+        <w:t xml:space="preserve">– Navbar - navbar-expand-lg, navbar-dark, collapse, navbar-toggler</w:t>
+      </w:r>
+    </w:p>
+    <w:p>
+      <w:pPr>
+        <w:spacing w:after="40" w:line="360"/>
+        <w:jc w:val="both"/>
+      </w:pPr>
+      <w:r>
+        <w:rPr>
+          <w:rFonts w:ascii="Times New Roman" w:cs="Times New Roman" w:eastAsia="Times New Roman" w:hAnsi="Times New Roman"/>
+          <w:sz w:val="28"/>
+          <w:szCs w:val="28"/>
+        </w:rPr>
+        <w:t xml:space="preserve">– Grid - container, row, col-lg-7/5, col-md-4/6/3, col-6</w:t>
+      </w:r>
+    </w:p>
+    <w:p>
+      <w:pPr>
+        <w:spacing w:after="40" w:line="360"/>
+        <w:jc w:val="both"/>
+      </w:pPr>
+      <w:r>
+        <w:rPr>
+          <w:rFonts w:ascii="Times New Roman" w:cs="Times New Roman" w:eastAsia="Times New Roman" w:hAnsi="Times New Roman"/>
+          <w:sz w:val="28"/>
+          <w:szCs w:val="28"/>
+        </w:rPr>
+        <w:t xml:space="preserve">– Cards - card, card-body, card-title, card-text, h-100</w:t>
+      </w:r>
+    </w:p>
+    <w:p>
+      <w:pPr>
+        <w:spacing w:after="40" w:line="360"/>
+        <w:jc w:val="both"/>
+      </w:pPr>
+      <w:r>
+        <w:rPr>
+          <w:rFonts w:ascii="Times New Roman" w:cs="Times New Roman" w:eastAsia="Times New Roman" w:hAnsi="Times New Roman"/>
+          <w:sz w:val="28"/>
+          <w:szCs w:val="28"/>
+        </w:rPr>
+        <w:t xml:space="preserve">– Table - table-striped, table-hover, table-responsive, align-middle</w:t>
+      </w:r>
+    </w:p>
+    <w:p>
+      <w:pPr>
+        <w:spacing w:after="40" w:line="360"/>
+        <w:jc w:val="both"/>
+      </w:pPr>
+      <w:r>
+        <w:rPr>
+          <w:rFonts w:ascii="Times New Roman" w:cs="Times New Roman" w:eastAsia="Times New Roman" w:hAnsi="Times New Roman"/>
+          <w:sz w:val="28"/>
+          <w:szCs w:val="28"/>
+        </w:rPr>
+        <w:t xml:space="preserve">– Utilities - mt-4, mb-5, py-4, text-center, fw-bold, lead, btn-lg, btn-outline-light</w:t>
       </w:r>
     </w:p>
     <w:p>
@@ -1302,7 +1302,7 @@
           <w:sz w:val="28"/>
           <w:szCs w:val="28"/>
         </w:rPr>
-        <w:t xml:space="preserve">3 точки переходу — 992px (зменшення h1), 768px (зменшення hero padding, заголовків, приховання турбін), 576px (зменшення lead та кнопок).</w:t>
+        <w:t xml:space="preserve">3 точки переходу - 992px (зменшення h1), 768px (зменшення hero padding, заголовків, приховання турбін), 576px (зменшення lead та кнопок).</w:t>
       </w:r>
     </w:p>
     <w:p>
@@ -1342,7 +1342,7 @@
           <w:sz w:val="28"/>
           <w:szCs w:val="28"/>
         </w:rPr>
-        <w:t xml:space="preserve">— фото вітрових турбін біля Азовського узбережжя на заході сонця. Використано у секції «Про об'єкт» як загальний вигляд.</w:t>
+        <w:t xml:space="preserve">- фото вітрових турбін біля Азовського узбережжя на заході сонця. Використано у секції «Про об'єкт» як загальний вигляд.</w:t>
       </w:r>
     </w:p>
     <w:p>
@@ -1428,7 +1428,7 @@
           <w:sz w:val="28"/>
           <w:szCs w:val="28"/>
         </w:rPr>
-        <w:t xml:space="preserve">— фото турбін у степовому полі. Використано у секції «Схема» для відображення розташування.</w:t>
+        <w:t xml:space="preserve">- фото турбін у степовому полі. Використано у секції «Схема» для відображення розташування.</w:t>
       </w:r>
     </w:p>
     <w:p>
@@ -1514,7 +1514,7 @@
           <w:sz w:val="28"/>
           <w:szCs w:val="28"/>
         </w:rPr>
-        <w:t xml:space="preserve">— однолінійна електрична схема у форматі SVG. Відображає ланцюг: Турбіни (50×3 МВт) → Генератор 0,69 кВ → Трансформатор 0,69/35 кВ → Кабельна мережа 35 кВ → ПС «Приазовська-35» 35/110 кВ → Шина 110 кВ → ОЕС України.</w:t>
+        <w:t xml:space="preserve">- однолінійна електрична схема у форматі SVG. Відображає ланцюг: Турбіни (50×3 МВт) → Генератор 0,69 кВ → Трансформатор 0,69/35 кВ → Кабельна мережа 35 кВ → ПС «Приазовська-35» 35/110 кВ → Шина 110 кВ → ОЕС України.</w:t>
       </w:r>
     </w:p>
     <w:p>
@@ -2465,7 +2465,7 @@
           <w:sz w:val="28"/>
           <w:szCs w:val="28"/>
         </w:rPr>
-        <w:t xml:space="preserve">В результаті виконання практичної роботи №1 було спроєктовано, реалізовано та протестовано інформаційний веб-сайт енергетичного об'єкта — вітрової електростанції «Приазовська» (Варіант 15, 150 МВт, Запорізька обл.).</w:t>
+        <w:t xml:space="preserve">В результаті виконання практичної роботи №1 було спроєктовано, реалізовано та протестовано інформаційний веб-сайт енергетичного об'єкта - вітрової електростанції «Приазовська» (Варіант 15, 150 МВт, Запорізька обл.).</w:t>
       </w:r>
     </w:p>
     <w:p>

</xml_diff>